<commit_message>
feat: Parcial parte 3 - Actualizacion punto 4
</commit_message>
<xml_diff>
--- a/docs/Formatos/RequerimientoFuncional1.docx
+++ b/docs/Formatos/RequerimientoFuncional1.docx
@@ -546,6 +546,9 @@
         <w:gridCol w:w="7280"/>
       </w:tblGrid>
       <w:tr>
+        <w:trPr>
+          <w:trHeight w:val="252"/>
+        </w:trPr>
         <w:tc>
           <w:tcPr>
             <w:tcW w:w="2800" w:type="dxa"/>
@@ -607,9 +610,44 @@
             <w:vAlign w:val="center"/>
           </w:tcPr>
           <w:p>
-            <w:proofErr w:type="spellStart"/>
-            <w:r>
-              <w:t>Opciones</w:t>
+            <w:r>
+              <w:t xml:space="preserve">El </w:t>
+            </w:r>
+            <w:proofErr w:type="spellStart"/>
+            <w:r>
+              <w:t>sistema</w:t>
+            </w:r>
+            <w:proofErr w:type="spellEnd"/>
+            <w:r>
+              <w:t xml:space="preserve"> debe </w:t>
+            </w:r>
+            <w:proofErr w:type="spellStart"/>
+            <w:r>
+              <w:t>permitir</w:t>
+            </w:r>
+            <w:proofErr w:type="spellEnd"/>
+            <w:r>
+              <w:t xml:space="preserve"> a los </w:t>
+            </w:r>
+            <w:proofErr w:type="spellStart"/>
+            <w:r>
+              <w:t>usuarios</w:t>
+            </w:r>
+            <w:proofErr w:type="spellEnd"/>
+            <w:r>
+              <w:t xml:space="preserve"> </w:t>
+            </w:r>
+            <w:proofErr w:type="spellStart"/>
+            <w:r>
+              <w:t>explorar</w:t>
+            </w:r>
+            <w:proofErr w:type="spellEnd"/>
+            <w:r>
+              <w:t xml:space="preserve"> el </w:t>
+            </w:r>
+            <w:proofErr w:type="spellStart"/>
+            <w:r>
+              <w:t>catálogo</w:t>
             </w:r>
             <w:proofErr w:type="spellEnd"/>
             <w:r>
@@ -617,25 +655,100 @@
             </w:r>
             <w:proofErr w:type="spellStart"/>
             <w:r>
-              <w:t>iteracion</w:t>
-            </w:r>
-            <w:proofErr w:type="spellEnd"/>
-            <w:r>
-              <w:t xml:space="preserve"> para realizer </w:t>
-            </w:r>
-            <w:proofErr w:type="spellStart"/>
-            <w:r>
-              <w:t>busquedas</w:t>
-            </w:r>
-            <w:proofErr w:type="spellEnd"/>
-            <w:r>
-              <w:t xml:space="preserve"> mas </w:t>
-            </w:r>
-            <w:proofErr w:type="spellStart"/>
-            <w:r>
-              <w:t>cortas</w:t>
-            </w:r>
-            <w:proofErr w:type="spellEnd"/>
+              <w:t>mascotas</w:t>
+            </w:r>
+            <w:proofErr w:type="spellEnd"/>
+            <w:r>
+              <w:t xml:space="preserve"> </w:t>
+            </w:r>
+            <w:proofErr w:type="spellStart"/>
+            <w:r>
+              <w:t>aplicando</w:t>
+            </w:r>
+            <w:proofErr w:type="spellEnd"/>
+            <w:r>
+              <w:t xml:space="preserve"> </w:t>
+            </w:r>
+            <w:proofErr w:type="spellStart"/>
+            <w:r>
+              <w:t>filtros</w:t>
+            </w:r>
+            <w:proofErr w:type="spellEnd"/>
+            <w:r>
+              <w:t xml:space="preserve"> </w:t>
+            </w:r>
+            <w:proofErr w:type="spellStart"/>
+            <w:r>
+              <w:t>dinámicos</w:t>
+            </w:r>
+            <w:proofErr w:type="spellEnd"/>
+            <w:r>
+              <w:t xml:space="preserve"> </w:t>
+            </w:r>
+            <w:proofErr w:type="spellStart"/>
+            <w:r>
+              <w:t>según</w:t>
+            </w:r>
+            <w:proofErr w:type="spellEnd"/>
+            <w:r>
+              <w:t xml:space="preserve"> </w:t>
+            </w:r>
+            <w:proofErr w:type="spellStart"/>
+            <w:r>
+              <w:t>distintos</w:t>
+            </w:r>
+            <w:proofErr w:type="spellEnd"/>
+            <w:r>
+              <w:t xml:space="preserve"> </w:t>
+            </w:r>
+            <w:proofErr w:type="spellStart"/>
+            <w:r>
+              <w:t>criterios</w:t>
+            </w:r>
+            <w:proofErr w:type="spellEnd"/>
+            <w:r>
+              <w:t xml:space="preserve"> (</w:t>
+            </w:r>
+            <w:proofErr w:type="spellStart"/>
+            <w:r>
+              <w:t>especie</w:t>
+            </w:r>
+            <w:proofErr w:type="spellEnd"/>
+            <w:r>
+              <w:t xml:space="preserve">, </w:t>
+            </w:r>
+            <w:proofErr w:type="spellStart"/>
+            <w:r>
+              <w:t>rango</w:t>
+            </w:r>
+            <w:proofErr w:type="spellEnd"/>
+            <w:r>
+              <w:t xml:space="preserve"> de </w:t>
+            </w:r>
+            <w:proofErr w:type="spellStart"/>
+            <w:r>
+              <w:t>edad</w:t>
+            </w:r>
+            <w:proofErr w:type="spellEnd"/>
+            <w:r>
+              <w:t xml:space="preserve">, </w:t>
+            </w:r>
+            <w:proofErr w:type="spellStart"/>
+            <w:r>
+              <w:t>compatibilidad</w:t>
+            </w:r>
+            <w:proofErr w:type="spellEnd"/>
+            <w:r>
+              <w:t xml:space="preserve"> y </w:t>
+            </w:r>
+            <w:proofErr w:type="spellStart"/>
+            <w:r>
+              <w:t>refugio</w:t>
+            </w:r>
+            <w:proofErr w:type="spellEnd"/>
+            <w:r>
+              <w:t>)</w:t>
+            </w:r>
           </w:p>
         </w:tc>
       </w:tr>
@@ -958,9 +1071,20 @@
             <w:vAlign w:val="center"/>
           </w:tcPr>
           <w:p>
-            <w:proofErr w:type="spellStart"/>
-            <w:r>
-              <w:t>Estar</w:t>
+            <w:r>
+              <w:t xml:space="preserve">El </w:t>
+            </w:r>
+            <w:proofErr w:type="spellStart"/>
+            <w:r>
+              <w:t>usuario</w:t>
+            </w:r>
+            <w:proofErr w:type="spellEnd"/>
+            <w:r>
+              <w:t xml:space="preserve"> debe </w:t>
+            </w:r>
+            <w:proofErr w:type="spellStart"/>
+            <w:r>
+              <w:t>estar</w:t>
             </w:r>
             <w:proofErr w:type="spellEnd"/>
             <w:r>
@@ -968,7 +1092,15 @@
             </w:r>
             <w:proofErr w:type="spellStart"/>
             <w:r>
-              <w:t>inscrito</w:t>
+              <w:t>registrado</w:t>
+            </w:r>
+            <w:proofErr w:type="spellEnd"/>
+            <w:r>
+              <w:t xml:space="preserve"> e </w:t>
+            </w:r>
+            <w:proofErr w:type="spellStart"/>
+            <w:r>
+              <w:t>iniciar</w:t>
             </w:r>
             <w:proofErr w:type="spellEnd"/>
             <w:r>
@@ -976,6 +1108,14 @@
             </w:r>
             <w:proofErr w:type="spellStart"/>
             <w:r>
+              <w:t>sesión</w:t>
+            </w:r>
+            <w:proofErr w:type="spellEnd"/>
+            <w:r>
+              <w:t xml:space="preserve"> </w:t>
+            </w:r>
+            <w:proofErr w:type="spellStart"/>
+            <w:r>
               <w:t>en</w:t>
             </w:r>
             <w:proofErr w:type="spellEnd"/>
@@ -987,6 +1127,82 @@
               <w:t>plataforma</w:t>
             </w:r>
             <w:proofErr w:type="spellEnd"/>
+            <w:r>
+              <w:t xml:space="preserve"> y</w:t>
+            </w:r>
+            <w:r>
+              <w:t xml:space="preserve"> </w:t>
+            </w:r>
+            <w:r>
+              <w:t>d</w:t>
+            </w:r>
+            <w:r>
+              <w:t xml:space="preserve">ebe </w:t>
+            </w:r>
+            <w:proofErr w:type="spellStart"/>
+            <w:r>
+              <w:t>existir</w:t>
+            </w:r>
+            <w:proofErr w:type="spellEnd"/>
+            <w:r>
+              <w:t xml:space="preserve"> al </w:t>
+            </w:r>
+            <w:proofErr w:type="spellStart"/>
+            <w:r>
+              <w:t>menos</w:t>
+            </w:r>
+            <w:proofErr w:type="spellEnd"/>
+            <w:r>
+              <w:t xml:space="preserve"> una </w:t>
+            </w:r>
+            <w:proofErr w:type="spellStart"/>
+            <w:r>
+              <w:t>mascota</w:t>
+            </w:r>
+            <w:proofErr w:type="spellEnd"/>
+            <w:r>
+              <w:t xml:space="preserve"> </w:t>
+            </w:r>
+            <w:proofErr w:type="spellStart"/>
+            <w:r>
+              <w:t>registrada</w:t>
+            </w:r>
+            <w:proofErr w:type="spellEnd"/>
+            <w:r>
+              <w:t xml:space="preserve"> </w:t>
+            </w:r>
+            <w:proofErr w:type="spellStart"/>
+            <w:r>
+              <w:t>en</w:t>
+            </w:r>
+            <w:proofErr w:type="spellEnd"/>
+            <w:r>
+              <w:t xml:space="preserve"> el </w:t>
+            </w:r>
+            <w:proofErr w:type="spellStart"/>
+            <w:r>
+              <w:t>sistema</w:t>
+            </w:r>
+            <w:proofErr w:type="spellEnd"/>
+            <w:r>
+              <w:t xml:space="preserve"> dentro del </w:t>
+            </w:r>
+            <w:proofErr w:type="spellStart"/>
+            <w:r>
+              <w:t>alcance</w:t>
+            </w:r>
+            <w:proofErr w:type="spellEnd"/>
+            <w:r>
+              <w:t xml:space="preserve"> </w:t>
+            </w:r>
+            <w:proofErr w:type="spellStart"/>
+            <w:r>
+              <w:t>seleccionado</w:t>
+            </w:r>
+            <w:proofErr w:type="spellEnd"/>
+            <w:r>
+              <w:t>.</w:t>
+            </w:r>
           </w:p>
         </w:tc>
       </w:tr>
@@ -1262,143 +1478,162 @@
           <w:p>
             <w:proofErr w:type="spellStart"/>
             <w:r>
+              <w:t>Iterador</w:t>
+            </w:r>
+            <w:proofErr w:type="spellEnd"/>
+          </w:p>
+        </w:tc>
+        <w:tc>
+          <w:tcPr>
+            <w:tcW w:w="3080" w:type="dxa"/>
+            <w:tcBorders>
+              <w:top w:val="single" w:sz="4" w:space="0" w:color="B7C2D6"/>
+              <w:left w:val="single" w:sz="4" w:space="0" w:color="B7C2D6"/>
+              <w:bottom w:val="single" w:sz="4" w:space="0" w:color="B7C2D6"/>
+              <w:right w:val="single" w:sz="4" w:space="0" w:color="B7C2D6"/>
+            </w:tcBorders>
+            <w:tcMar>
+              <w:top w:w="80" w:type="dxa"/>
+              <w:left w:w="130" w:type="dxa"/>
+              <w:bottom w:w="80" w:type="dxa"/>
+              <w:right w:w="130" w:type="dxa"/>
+            </w:tcMar>
+            <w:vAlign w:val="center"/>
+          </w:tcPr>
+          <w:p>
+            <w:r>
+              <w:t xml:space="preserve">Tipo de </w:t>
+            </w:r>
+            <w:proofErr w:type="spellStart"/>
+            <w:r>
+              <w:t>iterador</w:t>
+            </w:r>
+            <w:proofErr w:type="spellEnd"/>
+            <w:r>
+              <w:t xml:space="preserve"> </w:t>
+            </w:r>
+            <w:proofErr w:type="spellStart"/>
+            <w:r>
+              <w:t>seleccionado</w:t>
+            </w:r>
+            <w:proofErr w:type="spellEnd"/>
+            <w:r>
+              <w:t xml:space="preserve"> para la </w:t>
+            </w:r>
+            <w:proofErr w:type="spellStart"/>
+            <w:r>
+              <w:t>búsqueda</w:t>
+            </w:r>
+            <w:proofErr w:type="spellEnd"/>
+          </w:p>
+        </w:tc>
+        <w:tc>
+          <w:tcPr>
+            <w:tcW w:w="1800" w:type="dxa"/>
+            <w:tcBorders>
+              <w:top w:val="single" w:sz="4" w:space="0" w:color="B7C2D6"/>
+              <w:left w:val="single" w:sz="4" w:space="0" w:color="B7C2D6"/>
+              <w:bottom w:val="single" w:sz="4" w:space="0" w:color="B7C2D6"/>
+              <w:right w:val="single" w:sz="4" w:space="0" w:color="B7C2D6"/>
+            </w:tcBorders>
+            <w:tcMar>
+              <w:top w:w="80" w:type="dxa"/>
+              <w:left w:w="130" w:type="dxa"/>
+              <w:bottom w:w="80" w:type="dxa"/>
+              <w:right w:w="130" w:type="dxa"/>
+            </w:tcMar>
+            <w:vAlign w:val="center"/>
+          </w:tcPr>
+          <w:p>
+            <w:proofErr w:type="spellStart"/>
+            <w:r>
+              <w:t>Texto</w:t>
+            </w:r>
+            <w:proofErr w:type="spellEnd"/>
+          </w:p>
+        </w:tc>
+        <w:tc>
+          <w:tcPr>
+            <w:tcW w:w="2200" w:type="dxa"/>
+            <w:tcBorders>
+              <w:top w:val="single" w:sz="4" w:space="0" w:color="B7C2D6"/>
+              <w:left w:val="single" w:sz="4" w:space="0" w:color="B7C2D6"/>
+              <w:bottom w:val="single" w:sz="4" w:space="0" w:color="B7C2D6"/>
+              <w:right w:val="single" w:sz="4" w:space="0" w:color="B7C2D6"/>
+            </w:tcBorders>
+            <w:tcMar>
+              <w:top w:w="80" w:type="dxa"/>
+              <w:left w:w="130" w:type="dxa"/>
+              <w:bottom w:w="80" w:type="dxa"/>
+              <w:right w:w="130" w:type="dxa"/>
+            </w:tcMar>
+            <w:vAlign w:val="center"/>
+          </w:tcPr>
+          <w:p>
+            <w:proofErr w:type="spellStart"/>
+            <w:r>
+              <w:t>Valores</w:t>
+            </w:r>
+            <w:proofErr w:type="spellEnd"/>
+            <w:r>
+              <w:t xml:space="preserve"> </w:t>
+            </w:r>
+            <w:proofErr w:type="spellStart"/>
+            <w:r>
+              <w:t>permitidos</w:t>
+            </w:r>
+            <w:proofErr w:type="spellEnd"/>
+            <w:r>
+              <w:t xml:space="preserve">: </w:t>
+            </w:r>
+            <w:proofErr w:type="spellStart"/>
+            <w:r>
               <w:t>PorEspecie</w:t>
             </w:r>
             <w:proofErr w:type="spellEnd"/>
-          </w:p>
-        </w:tc>
-        <w:tc>
-          <w:tcPr>
-            <w:tcW w:w="3080" w:type="dxa"/>
-            <w:tcBorders>
-              <w:top w:val="single" w:sz="4" w:space="0" w:color="B7C2D6"/>
-              <w:left w:val="single" w:sz="4" w:space="0" w:color="B7C2D6"/>
-              <w:bottom w:val="single" w:sz="4" w:space="0" w:color="B7C2D6"/>
-              <w:right w:val="single" w:sz="4" w:space="0" w:color="B7C2D6"/>
-            </w:tcBorders>
-            <w:tcMar>
-              <w:top w:w="80" w:type="dxa"/>
-              <w:left w:w="130" w:type="dxa"/>
-              <w:bottom w:w="80" w:type="dxa"/>
-              <w:right w:w="130" w:type="dxa"/>
-            </w:tcMar>
-            <w:vAlign w:val="center"/>
-          </w:tcPr>
-          <w:p>
-            <w:proofErr w:type="spellStart"/>
-            <w:r>
-              <w:t>Iterador</w:t>
-            </w:r>
-            <w:proofErr w:type="spellEnd"/>
-            <w:r>
-              <w:t xml:space="preserve"> para </w:t>
-            </w:r>
-            <w:proofErr w:type="spellStart"/>
-            <w:r>
-              <w:t>filtrar</w:t>
-            </w:r>
-            <w:proofErr w:type="spellEnd"/>
-            <w:r>
-              <w:t xml:space="preserve"> las </w:t>
-            </w:r>
-            <w:proofErr w:type="spellStart"/>
-            <w:r>
-              <w:t>mascotas</w:t>
-            </w:r>
-            <w:proofErr w:type="spellEnd"/>
-            <w:r>
-              <w:t xml:space="preserve"> por </w:t>
-            </w:r>
-            <w:proofErr w:type="spellStart"/>
-            <w:r>
-              <w:t>especie</w:t>
-            </w:r>
-            <w:proofErr w:type="spellEnd"/>
-          </w:p>
-        </w:tc>
-        <w:tc>
-          <w:tcPr>
-            <w:tcW w:w="1800" w:type="dxa"/>
-            <w:tcBorders>
-              <w:top w:val="single" w:sz="4" w:space="0" w:color="B7C2D6"/>
-              <w:left w:val="single" w:sz="4" w:space="0" w:color="B7C2D6"/>
-              <w:bottom w:val="single" w:sz="4" w:space="0" w:color="B7C2D6"/>
-              <w:right w:val="single" w:sz="4" w:space="0" w:color="B7C2D6"/>
-            </w:tcBorders>
-            <w:tcMar>
-              <w:top w:w="80" w:type="dxa"/>
-              <w:left w:w="130" w:type="dxa"/>
-              <w:bottom w:w="80" w:type="dxa"/>
-              <w:right w:w="130" w:type="dxa"/>
-            </w:tcMar>
-            <w:vAlign w:val="center"/>
-          </w:tcPr>
-          <w:p>
-            <w:proofErr w:type="spellStart"/>
-            <w:r>
-              <w:t>Texto</w:t>
-            </w:r>
-            <w:proofErr w:type="spellEnd"/>
-          </w:p>
-        </w:tc>
-        <w:tc>
-          <w:tcPr>
-            <w:tcW w:w="2200" w:type="dxa"/>
-            <w:tcBorders>
-              <w:top w:val="single" w:sz="4" w:space="0" w:color="B7C2D6"/>
-              <w:left w:val="single" w:sz="4" w:space="0" w:color="B7C2D6"/>
-              <w:bottom w:val="single" w:sz="4" w:space="0" w:color="B7C2D6"/>
-              <w:right w:val="single" w:sz="4" w:space="0" w:color="B7C2D6"/>
-            </w:tcBorders>
-            <w:tcMar>
-              <w:top w:w="80" w:type="dxa"/>
-              <w:left w:w="130" w:type="dxa"/>
-              <w:bottom w:w="80" w:type="dxa"/>
-              <w:right w:w="130" w:type="dxa"/>
-            </w:tcMar>
-            <w:vAlign w:val="center"/>
-          </w:tcPr>
-          <w:p>
-            <w:r>
-              <w:t xml:space="preserve">Primer </w:t>
-            </w:r>
-            <w:proofErr w:type="spellStart"/>
-            <w:r>
-              <w:t>filtro</w:t>
-            </w:r>
-            <w:proofErr w:type="spellEnd"/>
-            <w:r>
-              <w:t xml:space="preserve"> para </w:t>
-            </w:r>
-            <w:proofErr w:type="spellStart"/>
-            <w:r>
-              <w:t>separar</w:t>
-            </w:r>
-            <w:proofErr w:type="spellEnd"/>
-            <w:r>
-              <w:t xml:space="preserve"> las </w:t>
-            </w:r>
-            <w:proofErr w:type="spellStart"/>
-            <w:r>
-              <w:t>mascotas</w:t>
-            </w:r>
-            <w:proofErr w:type="spellEnd"/>
-            <w:r>
-              <w:t xml:space="preserve"> de la </w:t>
-            </w:r>
-            <w:proofErr w:type="spellStart"/>
-            <w:r>
-              <w:t>especie</w:t>
-            </w:r>
-            <w:proofErr w:type="spellEnd"/>
-            <w:r>
-              <w:t xml:space="preserve"> </w:t>
-            </w:r>
-            <w:proofErr w:type="spellStart"/>
-            <w:r>
-              <w:t>buscada</w:t>
-            </w:r>
-            <w:proofErr w:type="spellEnd"/>
+            <w:r>
+              <w:t xml:space="preserve">, </w:t>
+            </w:r>
+            <w:proofErr w:type="spellStart"/>
+            <w:r>
+              <w:t>PorRangoEdad</w:t>
+            </w:r>
+            <w:proofErr w:type="spellEnd"/>
+            <w:r>
+              <w:t xml:space="preserve">, </w:t>
+            </w:r>
+            <w:proofErr w:type="spellStart"/>
+            <w:r>
+              <w:t>PorCompatibilidad</w:t>
+            </w:r>
+            <w:proofErr w:type="spellEnd"/>
+            <w:r>
+              <w:t xml:space="preserve">, </w:t>
+            </w:r>
+            <w:proofErr w:type="spellStart"/>
+            <w:r>
+              <w:t>PorRefugio</w:t>
+            </w:r>
+            <w:proofErr w:type="spellEnd"/>
+            <w:r>
+              <w:t xml:space="preserve">. Define la </w:t>
+            </w:r>
+            <w:proofErr w:type="spellStart"/>
+            <w:r>
+              <w:t>estrategia</w:t>
+            </w:r>
+            <w:proofErr w:type="spellEnd"/>
+            <w:r>
+              <w:t xml:space="preserve"> de </w:t>
+            </w:r>
+            <w:proofErr w:type="spellStart"/>
+            <w:r>
+              <w:t>recorrido</w:t>
+            </w:r>
+            <w:proofErr w:type="spellEnd"/>
+            <w:r>
+              <w:t>.</w:t>
+            </w:r>
           </w:p>
         </w:tc>
         <w:tc>
@@ -1449,6 +1684,209 @@
           <w:p>
             <w:proofErr w:type="spellStart"/>
             <w:r>
+              <w:t>Alcance</w:t>
+            </w:r>
+            <w:proofErr w:type="spellEnd"/>
+          </w:p>
+        </w:tc>
+        <w:tc>
+          <w:tcPr>
+            <w:tcW w:w="3080" w:type="dxa"/>
+            <w:tcBorders>
+              <w:top w:val="single" w:sz="4" w:space="0" w:color="B7C2D6"/>
+              <w:left w:val="single" w:sz="4" w:space="0" w:color="B7C2D6"/>
+              <w:bottom w:val="single" w:sz="4" w:space="0" w:color="B7C2D6"/>
+              <w:right w:val="single" w:sz="4" w:space="0" w:color="B7C2D6"/>
+            </w:tcBorders>
+            <w:tcMar>
+              <w:top w:w="80" w:type="dxa"/>
+              <w:left w:w="130" w:type="dxa"/>
+              <w:bottom w:w="80" w:type="dxa"/>
+              <w:right w:w="130" w:type="dxa"/>
+            </w:tcMar>
+            <w:vAlign w:val="center"/>
+          </w:tcPr>
+          <w:p>
+            <w:r>
+              <w:t xml:space="preserve">Nivel </w:t>
+            </w:r>
+            <w:proofErr w:type="spellStart"/>
+            <w:r>
+              <w:t>jerárquico</w:t>
+            </w:r>
+            <w:proofErr w:type="spellEnd"/>
+            <w:r>
+              <w:t xml:space="preserve"> </w:t>
+            </w:r>
+            <w:proofErr w:type="spellStart"/>
+            <w:r>
+              <w:t>donde</w:t>
+            </w:r>
+            <w:proofErr w:type="spellEnd"/>
+            <w:r>
+              <w:t xml:space="preserve"> se </w:t>
+            </w:r>
+            <w:proofErr w:type="spellStart"/>
+            <w:r>
+              <w:t>realizará</w:t>
+            </w:r>
+            <w:proofErr w:type="spellEnd"/>
+            <w:r>
+              <w:t xml:space="preserve"> la </w:t>
+            </w:r>
+            <w:proofErr w:type="spellStart"/>
+            <w:r>
+              <w:t>búsqueda</w:t>
+            </w:r>
+            <w:proofErr w:type="spellEnd"/>
+          </w:p>
+        </w:tc>
+        <w:tc>
+          <w:tcPr>
+            <w:tcW w:w="1800" w:type="dxa"/>
+            <w:tcBorders>
+              <w:top w:val="single" w:sz="4" w:space="0" w:color="B7C2D6"/>
+              <w:left w:val="single" w:sz="4" w:space="0" w:color="B7C2D6"/>
+              <w:bottom w:val="single" w:sz="4" w:space="0" w:color="B7C2D6"/>
+              <w:right w:val="single" w:sz="4" w:space="0" w:color="B7C2D6"/>
+            </w:tcBorders>
+            <w:tcMar>
+              <w:top w:w="80" w:type="dxa"/>
+              <w:left w:w="130" w:type="dxa"/>
+              <w:bottom w:w="80" w:type="dxa"/>
+              <w:right w:w="130" w:type="dxa"/>
+            </w:tcMar>
+            <w:vAlign w:val="center"/>
+          </w:tcPr>
+          <w:p>
+            <w:proofErr w:type="spellStart"/>
+            <w:r>
+              <w:t>Texto</w:t>
+            </w:r>
+            <w:proofErr w:type="spellEnd"/>
+          </w:p>
+        </w:tc>
+        <w:tc>
+          <w:tcPr>
+            <w:tcW w:w="2200" w:type="dxa"/>
+            <w:tcBorders>
+              <w:top w:val="single" w:sz="4" w:space="0" w:color="B7C2D6"/>
+              <w:left w:val="single" w:sz="4" w:space="0" w:color="B7C2D6"/>
+              <w:bottom w:val="single" w:sz="4" w:space="0" w:color="B7C2D6"/>
+              <w:right w:val="single" w:sz="4" w:space="0" w:color="B7C2D6"/>
+            </w:tcBorders>
+            <w:tcMar>
+              <w:top w:w="80" w:type="dxa"/>
+              <w:left w:w="130" w:type="dxa"/>
+              <w:bottom w:w="80" w:type="dxa"/>
+              <w:right w:w="130" w:type="dxa"/>
+            </w:tcMar>
+            <w:vAlign w:val="center"/>
+          </w:tcPr>
+          <w:p>
+            <w:proofErr w:type="spellStart"/>
+            <w:r>
+              <w:t>Valores</w:t>
+            </w:r>
+            <w:proofErr w:type="spellEnd"/>
+            <w:r>
+              <w:t xml:space="preserve">: Red Nacional, Ciudad </w:t>
+            </w:r>
+            <w:proofErr w:type="spellStart"/>
+            <w:r>
+              <w:t>específica</w:t>
+            </w:r>
+            <w:proofErr w:type="spellEnd"/>
+            <w:r>
+              <w:t xml:space="preserve">, Refugio </w:t>
+            </w:r>
+            <w:proofErr w:type="spellStart"/>
+            <w:r>
+              <w:t>específico</w:t>
+            </w:r>
+            <w:proofErr w:type="spellEnd"/>
+            <w:r>
+              <w:t xml:space="preserve">. </w:t>
+            </w:r>
+            <w:proofErr w:type="spellStart"/>
+            <w:r>
+              <w:t>Determina</w:t>
+            </w:r>
+            <w:proofErr w:type="spellEnd"/>
+            <w:r>
+              <w:t xml:space="preserve"> el </w:t>
+            </w:r>
+            <w:proofErr w:type="spellStart"/>
+            <w:r>
+              <w:t>nodo</w:t>
+            </w:r>
+            <w:proofErr w:type="spellEnd"/>
+            <w:r>
+              <w:t xml:space="preserve"> </w:t>
+            </w:r>
+            <w:proofErr w:type="spellStart"/>
+            <w:r>
+              <w:t>raíz</w:t>
+            </w:r>
+            <w:proofErr w:type="spellEnd"/>
+            <w:r>
+              <w:t xml:space="preserve"> del </w:t>
+            </w:r>
+            <w:proofErr w:type="spellStart"/>
+            <w:r>
+              <w:t>recorrido</w:t>
+            </w:r>
+            <w:proofErr w:type="spellEnd"/>
+            <w:r>
+              <w:t>.</w:t>
+            </w:r>
+          </w:p>
+        </w:tc>
+        <w:tc>
+          <w:tcPr>
+            <w:tcW w:w="1000" w:type="dxa"/>
+            <w:tcBorders>
+              <w:top w:val="single" w:sz="4" w:space="0" w:color="B7C2D6"/>
+              <w:left w:val="single" w:sz="4" w:space="0" w:color="B7C2D6"/>
+              <w:bottom w:val="single" w:sz="4" w:space="0" w:color="B7C2D6"/>
+              <w:right w:val="single" w:sz="4" w:space="0" w:color="B7C2D6"/>
+            </w:tcBorders>
+            <w:tcMar>
+              <w:top w:w="80" w:type="dxa"/>
+              <w:left w:w="130" w:type="dxa"/>
+              <w:bottom w:w="80" w:type="dxa"/>
+              <w:right w:w="130" w:type="dxa"/>
+            </w:tcMar>
+            <w:vAlign w:val="center"/>
+          </w:tcPr>
+          <w:p>
+            <w:r>
+              <w:t>SI</w:t>
+            </w:r>
+          </w:p>
+        </w:tc>
+      </w:tr>
+      <w:tr>
+        <w:tc>
+          <w:tcPr>
+            <w:tcW w:w="2000" w:type="dxa"/>
+            <w:tcBorders>
+              <w:top w:val="single" w:sz="4" w:space="0" w:color="B7C2D6"/>
+              <w:left w:val="single" w:sz="4" w:space="0" w:color="B7C2D6"/>
+              <w:bottom w:val="single" w:sz="4" w:space="0" w:color="B7C2D6"/>
+              <w:right w:val="single" w:sz="4" w:space="0" w:color="B7C2D6"/>
+            </w:tcBorders>
+            <w:tcMar>
+              <w:top w:w="80" w:type="dxa"/>
+              <w:left w:w="130" w:type="dxa"/>
+              <w:bottom w:w="80" w:type="dxa"/>
+              <w:right w:w="130" w:type="dxa"/>
+            </w:tcMar>
+            <w:vAlign w:val="center"/>
+          </w:tcPr>
+          <w:p>
+            <w:proofErr w:type="spellStart"/>
+            <w:r>
               <w:t>Especie</w:t>
             </w:r>
             <w:proofErr w:type="spellEnd"/>
@@ -1474,31 +1912,108 @@
           <w:p>
             <w:proofErr w:type="spellStart"/>
             <w:r>
+              <w:t>Especie</w:t>
+            </w:r>
+            <w:proofErr w:type="spellEnd"/>
+            <w:r>
+              <w:t xml:space="preserve"> de </w:t>
+            </w:r>
+            <w:proofErr w:type="spellStart"/>
+            <w:r>
+              <w:t>mascota</w:t>
+            </w:r>
+            <w:proofErr w:type="spellEnd"/>
+            <w:r>
+              <w:t xml:space="preserve"> a </w:t>
+            </w:r>
+            <w:proofErr w:type="spellStart"/>
+            <w:r>
+              <w:t>filtrar</w:t>
+            </w:r>
+            <w:proofErr w:type="spellEnd"/>
+            <w:r>
+              <w:t xml:space="preserve"> (solo </w:t>
+            </w:r>
+            <w:proofErr w:type="spellStart"/>
+            <w:r>
+              <w:t>si</w:t>
+            </w:r>
+            <w:proofErr w:type="spellEnd"/>
+            <w:r>
+              <w:t xml:space="preserve"> </w:t>
+            </w:r>
+            <w:proofErr w:type="spellStart"/>
+            <w:r>
               <w:t>Iterador</w:t>
             </w:r>
             <w:proofErr w:type="spellEnd"/>
             <w:r>
-              <w:t xml:space="preserve"> para </w:t>
-            </w:r>
-            <w:proofErr w:type="spellStart"/>
-            <w:r>
-              <w:t>filtrar</w:t>
-            </w:r>
-            <w:proofErr w:type="spellEnd"/>
-            <w:r>
-              <w:t xml:space="preserve"> solo las </w:t>
-            </w:r>
-            <w:proofErr w:type="spellStart"/>
-            <w:r>
-              <w:t>mascotas</w:t>
-            </w:r>
-            <w:proofErr w:type="spellEnd"/>
-            <w:r>
-              <w:t xml:space="preserve"> de la </w:t>
-            </w:r>
-            <w:proofErr w:type="spellStart"/>
-            <w:r>
-              <w:t>especie</w:t>
+              <w:t xml:space="preserve"> = </w:t>
+            </w:r>
+            <w:proofErr w:type="spellStart"/>
+            <w:r>
+              <w:t>PorEspecie</w:t>
+            </w:r>
+            <w:proofErr w:type="spellEnd"/>
+            <w:r>
+              <w:t>)</w:t>
+            </w:r>
+          </w:p>
+        </w:tc>
+        <w:tc>
+          <w:tcPr>
+            <w:tcW w:w="1800" w:type="dxa"/>
+            <w:tcBorders>
+              <w:top w:val="single" w:sz="4" w:space="0" w:color="B7C2D6"/>
+              <w:left w:val="single" w:sz="4" w:space="0" w:color="B7C2D6"/>
+              <w:bottom w:val="single" w:sz="4" w:space="0" w:color="B7C2D6"/>
+              <w:right w:val="single" w:sz="4" w:space="0" w:color="B7C2D6"/>
+            </w:tcBorders>
+            <w:tcMar>
+              <w:top w:w="80" w:type="dxa"/>
+              <w:left w:w="130" w:type="dxa"/>
+              <w:bottom w:w="80" w:type="dxa"/>
+              <w:right w:w="130" w:type="dxa"/>
+            </w:tcMar>
+            <w:vAlign w:val="center"/>
+          </w:tcPr>
+          <w:p>
+            <w:proofErr w:type="spellStart"/>
+            <w:r>
+              <w:t>Texto</w:t>
+            </w:r>
+            <w:proofErr w:type="spellEnd"/>
+          </w:p>
+        </w:tc>
+        <w:tc>
+          <w:tcPr>
+            <w:tcW w:w="2200" w:type="dxa"/>
+            <w:tcBorders>
+              <w:top w:val="single" w:sz="4" w:space="0" w:color="B7C2D6"/>
+              <w:left w:val="single" w:sz="4" w:space="0" w:color="B7C2D6"/>
+              <w:bottom w:val="single" w:sz="4" w:space="0" w:color="B7C2D6"/>
+              <w:right w:val="single" w:sz="4" w:space="0" w:color="B7C2D6"/>
+            </w:tcBorders>
+            <w:tcMar>
+              <w:top w:w="80" w:type="dxa"/>
+              <w:left w:w="130" w:type="dxa"/>
+              <w:bottom w:w="80" w:type="dxa"/>
+              <w:right w:w="130" w:type="dxa"/>
+            </w:tcMar>
+            <w:vAlign w:val="center"/>
+          </w:tcPr>
+          <w:p>
+            <w:proofErr w:type="spellStart"/>
+            <w:r>
+              <w:t>Valores</w:t>
+            </w:r>
+            <w:proofErr w:type="spellEnd"/>
+            <w:r>
+              <w:t xml:space="preserve">: PERRO, GATO, CONEJO, AVE, REPTIL. </w:t>
+            </w:r>
+            <w:proofErr w:type="spellStart"/>
+            <w:r>
+              <w:t>Aplica</w:t>
             </w:r>
             <w:proofErr w:type="spellEnd"/>
             <w:r>
@@ -1506,94 +2021,36 @@
             </w:r>
             <w:proofErr w:type="spellStart"/>
             <w:r>
-              <w:t>buscada</w:t>
+              <w:t>únicamente</w:t>
             </w:r>
             <w:proofErr w:type="spellEnd"/>
             <w:r>
               <w:t xml:space="preserve"> </w:t>
             </w:r>
-          </w:p>
-        </w:tc>
-        <w:tc>
-          <w:tcPr>
-            <w:tcW w:w="1800" w:type="dxa"/>
-            <w:tcBorders>
-              <w:top w:val="single" w:sz="4" w:space="0" w:color="B7C2D6"/>
-              <w:left w:val="single" w:sz="4" w:space="0" w:color="B7C2D6"/>
-              <w:bottom w:val="single" w:sz="4" w:space="0" w:color="B7C2D6"/>
-              <w:right w:val="single" w:sz="4" w:space="0" w:color="B7C2D6"/>
-            </w:tcBorders>
-            <w:tcMar>
-              <w:top w:w="80" w:type="dxa"/>
-              <w:left w:w="130" w:type="dxa"/>
-              <w:bottom w:w="80" w:type="dxa"/>
-              <w:right w:w="130" w:type="dxa"/>
-            </w:tcMar>
-            <w:vAlign w:val="center"/>
-          </w:tcPr>
-          <w:p>
-            <w:proofErr w:type="spellStart"/>
-            <w:r>
-              <w:t>Texto</w:t>
-            </w:r>
-            <w:proofErr w:type="spellEnd"/>
-          </w:p>
-        </w:tc>
-        <w:tc>
-          <w:tcPr>
-            <w:tcW w:w="2200" w:type="dxa"/>
-            <w:tcBorders>
-              <w:top w:val="single" w:sz="4" w:space="0" w:color="B7C2D6"/>
-              <w:left w:val="single" w:sz="4" w:space="0" w:color="B7C2D6"/>
-              <w:bottom w:val="single" w:sz="4" w:space="0" w:color="B7C2D6"/>
-              <w:right w:val="single" w:sz="4" w:space="0" w:color="B7C2D6"/>
-            </w:tcBorders>
-            <w:tcMar>
-              <w:top w:w="80" w:type="dxa"/>
-              <w:left w:w="130" w:type="dxa"/>
-              <w:bottom w:w="80" w:type="dxa"/>
-              <w:right w:w="130" w:type="dxa"/>
-            </w:tcMar>
-            <w:vAlign w:val="center"/>
-          </w:tcPr>
-          <w:p>
-            <w:proofErr w:type="spellStart"/>
-            <w:r>
-              <w:t>Filtro</w:t>
-            </w:r>
-            <w:proofErr w:type="spellEnd"/>
-            <w:r>
-              <w:t xml:space="preserve"> que se </w:t>
-            </w:r>
-            <w:proofErr w:type="spellStart"/>
-            <w:r>
-              <w:t>aplica</w:t>
-            </w:r>
-            <w:proofErr w:type="spellEnd"/>
-            <w:r>
-              <w:t xml:space="preserve"> para solo </w:t>
-            </w:r>
-            <w:proofErr w:type="spellStart"/>
-            <w:r>
-              <w:t>buscar</w:t>
-            </w:r>
-            <w:proofErr w:type="spellEnd"/>
-            <w:r>
-              <w:t xml:space="preserve"> </w:t>
-            </w:r>
-            <w:proofErr w:type="spellStart"/>
-            <w:r>
-              <w:t>mascotas</w:t>
-            </w:r>
-            <w:proofErr w:type="spellEnd"/>
-            <w:r>
-              <w:t xml:space="preserve"> por </w:t>
-            </w:r>
-            <w:proofErr w:type="spellStart"/>
-            <w:r>
-              <w:t>especie</w:t>
-            </w:r>
-            <w:proofErr w:type="spellEnd"/>
+            <w:proofErr w:type="spellStart"/>
+            <w:r>
+              <w:t>cuando</w:t>
+            </w:r>
+            <w:proofErr w:type="spellEnd"/>
+            <w:r>
+              <w:t xml:space="preserve"> el </w:t>
+            </w:r>
+            <w:proofErr w:type="spellStart"/>
+            <w:r>
+              <w:t>iterador</w:t>
+            </w:r>
+            <w:proofErr w:type="spellEnd"/>
+            <w:r>
+              <w:t xml:space="preserve"> es </w:t>
+            </w:r>
+            <w:proofErr w:type="spellStart"/>
+            <w:r>
+              <w:t>PorEspecie</w:t>
+            </w:r>
+            <w:proofErr w:type="spellEnd"/>
+            <w:r>
+              <w:t>.</w:t>
+            </w:r>
           </w:p>
         </w:tc>
         <w:tc>
@@ -1957,8 +2414,6 @@
             <w:r>
               <w:t>Texto</w:t>
             </w:r>
-            <w:bookmarkStart w:id="0" w:name="_GoBack"/>
-            <w:bookmarkEnd w:id="0"/>
           </w:p>
         </w:tc>
         <w:tc>
@@ -2000,6 +2455,524 @@
               <w:t>filtros</w:t>
             </w:r>
             <w:proofErr w:type="spellEnd"/>
+          </w:p>
+        </w:tc>
+        <w:tc>
+          <w:tcPr>
+            <w:tcW w:w="1000" w:type="dxa"/>
+            <w:tcBorders>
+              <w:top w:val="single" w:sz="4" w:space="0" w:color="B7C2D6"/>
+              <w:left w:val="single" w:sz="4" w:space="0" w:color="B7C2D6"/>
+              <w:bottom w:val="single" w:sz="4" w:space="0" w:color="B7C2D6"/>
+              <w:right w:val="single" w:sz="4" w:space="0" w:color="B7C2D6"/>
+            </w:tcBorders>
+            <w:tcMar>
+              <w:top w:w="80" w:type="dxa"/>
+              <w:left w:w="130" w:type="dxa"/>
+              <w:bottom w:w="80" w:type="dxa"/>
+              <w:right w:w="130" w:type="dxa"/>
+            </w:tcMar>
+            <w:vAlign w:val="center"/>
+          </w:tcPr>
+          <w:p>
+            <w:r>
+              <w:t>SI</w:t>
+            </w:r>
+          </w:p>
+        </w:tc>
+      </w:tr>
+      <w:tr>
+        <w:tc>
+          <w:tcPr>
+            <w:tcW w:w="2000" w:type="dxa"/>
+            <w:tcBorders>
+              <w:top w:val="single" w:sz="4" w:space="0" w:color="B7C2D6"/>
+              <w:left w:val="single" w:sz="4" w:space="0" w:color="B7C2D6"/>
+              <w:bottom w:val="single" w:sz="4" w:space="0" w:color="B7C2D6"/>
+              <w:right w:val="single" w:sz="4" w:space="0" w:color="B7C2D6"/>
+            </w:tcBorders>
+            <w:tcMar>
+              <w:top w:w="80" w:type="dxa"/>
+              <w:left w:w="130" w:type="dxa"/>
+              <w:bottom w:w="80" w:type="dxa"/>
+              <w:right w:w="130" w:type="dxa"/>
+            </w:tcMar>
+            <w:vAlign w:val="center"/>
+          </w:tcPr>
+          <w:p>
+            <w:r>
+              <w:t>I</w:t>
+            </w:r>
+            <w:r>
+              <w:t xml:space="preserve">D </w:t>
+            </w:r>
+            <w:proofErr w:type="spellStart"/>
+            <w:r>
+              <w:t>Mascota</w:t>
+            </w:r>
+            <w:proofErr w:type="spellEnd"/>
+          </w:p>
+        </w:tc>
+        <w:tc>
+          <w:tcPr>
+            <w:tcW w:w="3080" w:type="dxa"/>
+            <w:tcBorders>
+              <w:top w:val="single" w:sz="4" w:space="0" w:color="B7C2D6"/>
+              <w:left w:val="single" w:sz="4" w:space="0" w:color="B7C2D6"/>
+              <w:bottom w:val="single" w:sz="4" w:space="0" w:color="B7C2D6"/>
+              <w:right w:val="single" w:sz="4" w:space="0" w:color="B7C2D6"/>
+            </w:tcBorders>
+            <w:tcMar>
+              <w:top w:w="80" w:type="dxa"/>
+              <w:left w:w="130" w:type="dxa"/>
+              <w:bottom w:w="80" w:type="dxa"/>
+              <w:right w:w="130" w:type="dxa"/>
+            </w:tcMar>
+            <w:vAlign w:val="center"/>
+          </w:tcPr>
+          <w:p>
+            <w:proofErr w:type="spellStart"/>
+            <w:r>
+              <w:t>Identificador</w:t>
+            </w:r>
+            <w:proofErr w:type="spellEnd"/>
+            <w:r>
+              <w:t xml:space="preserve"> </w:t>
+            </w:r>
+            <w:proofErr w:type="spellStart"/>
+            <w:r>
+              <w:t>único</w:t>
+            </w:r>
+            <w:proofErr w:type="spellEnd"/>
+            <w:r>
+              <w:t xml:space="preserve"> de la </w:t>
+            </w:r>
+            <w:proofErr w:type="spellStart"/>
+            <w:r>
+              <w:t>mascota</w:t>
+            </w:r>
+            <w:proofErr w:type="spellEnd"/>
+          </w:p>
+        </w:tc>
+        <w:tc>
+          <w:tcPr>
+            <w:tcW w:w="1800" w:type="dxa"/>
+            <w:tcBorders>
+              <w:top w:val="single" w:sz="4" w:space="0" w:color="B7C2D6"/>
+              <w:left w:val="single" w:sz="4" w:space="0" w:color="B7C2D6"/>
+              <w:bottom w:val="single" w:sz="4" w:space="0" w:color="B7C2D6"/>
+              <w:right w:val="single" w:sz="4" w:space="0" w:color="B7C2D6"/>
+            </w:tcBorders>
+            <w:tcMar>
+              <w:top w:w="80" w:type="dxa"/>
+              <w:left w:w="130" w:type="dxa"/>
+              <w:bottom w:w="80" w:type="dxa"/>
+              <w:right w:w="130" w:type="dxa"/>
+            </w:tcMar>
+            <w:vAlign w:val="center"/>
+          </w:tcPr>
+          <w:p>
+            <w:proofErr w:type="spellStart"/>
+            <w:r>
+              <w:t>Texto</w:t>
+            </w:r>
+            <w:proofErr w:type="spellEnd"/>
+          </w:p>
+        </w:tc>
+        <w:tc>
+          <w:tcPr>
+            <w:tcW w:w="2200" w:type="dxa"/>
+            <w:tcBorders>
+              <w:top w:val="single" w:sz="4" w:space="0" w:color="B7C2D6"/>
+              <w:left w:val="single" w:sz="4" w:space="0" w:color="B7C2D6"/>
+              <w:bottom w:val="single" w:sz="4" w:space="0" w:color="B7C2D6"/>
+              <w:right w:val="single" w:sz="4" w:space="0" w:color="B7C2D6"/>
+            </w:tcBorders>
+            <w:tcMar>
+              <w:top w:w="80" w:type="dxa"/>
+              <w:left w:w="130" w:type="dxa"/>
+              <w:bottom w:w="80" w:type="dxa"/>
+              <w:right w:w="130" w:type="dxa"/>
+            </w:tcMar>
+            <w:vAlign w:val="center"/>
+          </w:tcPr>
+          <w:p>
+            <w:proofErr w:type="spellStart"/>
+            <w:r>
+              <w:t>Formato</w:t>
+            </w:r>
+            <w:proofErr w:type="spellEnd"/>
+            <w:r>
+              <w:t>: [ESPECIE]-### (</w:t>
+            </w:r>
+            <w:proofErr w:type="spellStart"/>
+            <w:r>
+              <w:t>ej</w:t>
+            </w:r>
+            <w:proofErr w:type="spellEnd"/>
+            <w:r>
+              <w:t xml:space="preserve">. PERRO-001). Se </w:t>
+            </w:r>
+            <w:proofErr w:type="spellStart"/>
+            <w:r>
+              <w:t>muestra</w:t>
+            </w:r>
+            <w:proofErr w:type="spellEnd"/>
+            <w:r>
+              <w:t xml:space="preserve"> </w:t>
+            </w:r>
+            <w:proofErr w:type="spellStart"/>
+            <w:r>
+              <w:t>en</w:t>
+            </w:r>
+            <w:proofErr w:type="spellEnd"/>
+            <w:r>
+              <w:t xml:space="preserve"> </w:t>
+            </w:r>
+            <w:proofErr w:type="spellStart"/>
+            <w:r>
+              <w:t>cada</w:t>
+            </w:r>
+            <w:proofErr w:type="spellEnd"/>
+            <w:r>
+              <w:t xml:space="preserve"> </w:t>
+            </w:r>
+            <w:proofErr w:type="spellStart"/>
+            <w:r>
+              <w:t>resultado</w:t>
+            </w:r>
+            <w:proofErr w:type="spellEnd"/>
+            <w:r>
+              <w:t>.</w:t>
+            </w:r>
+          </w:p>
+        </w:tc>
+        <w:tc>
+          <w:tcPr>
+            <w:tcW w:w="1000" w:type="dxa"/>
+            <w:tcBorders>
+              <w:top w:val="single" w:sz="4" w:space="0" w:color="B7C2D6"/>
+              <w:left w:val="single" w:sz="4" w:space="0" w:color="B7C2D6"/>
+              <w:bottom w:val="single" w:sz="4" w:space="0" w:color="B7C2D6"/>
+              <w:right w:val="single" w:sz="4" w:space="0" w:color="B7C2D6"/>
+            </w:tcBorders>
+            <w:tcMar>
+              <w:top w:w="80" w:type="dxa"/>
+              <w:left w:w="130" w:type="dxa"/>
+              <w:bottom w:w="80" w:type="dxa"/>
+              <w:right w:w="130" w:type="dxa"/>
+            </w:tcMar>
+            <w:vAlign w:val="center"/>
+          </w:tcPr>
+          <w:p>
+            <w:r>
+              <w:t>SI</w:t>
+            </w:r>
+          </w:p>
+        </w:tc>
+      </w:tr>
+      <w:tr>
+        <w:tc>
+          <w:tcPr>
+            <w:tcW w:w="2000" w:type="dxa"/>
+            <w:tcBorders>
+              <w:top w:val="single" w:sz="4" w:space="0" w:color="B7C2D6"/>
+              <w:left w:val="single" w:sz="4" w:space="0" w:color="B7C2D6"/>
+              <w:bottom w:val="single" w:sz="4" w:space="0" w:color="B7C2D6"/>
+              <w:right w:val="single" w:sz="4" w:space="0" w:color="B7C2D6"/>
+            </w:tcBorders>
+            <w:tcMar>
+              <w:top w:w="80" w:type="dxa"/>
+              <w:left w:w="130" w:type="dxa"/>
+              <w:bottom w:w="80" w:type="dxa"/>
+              <w:right w:w="130" w:type="dxa"/>
+            </w:tcMar>
+            <w:vAlign w:val="center"/>
+          </w:tcPr>
+          <w:p>
+            <w:proofErr w:type="spellStart"/>
+            <w:r>
+              <w:t>Nombre</w:t>
+            </w:r>
+            <w:proofErr w:type="spellEnd"/>
+          </w:p>
+        </w:tc>
+        <w:tc>
+          <w:tcPr>
+            <w:tcW w:w="3080" w:type="dxa"/>
+            <w:tcBorders>
+              <w:top w:val="single" w:sz="4" w:space="0" w:color="B7C2D6"/>
+              <w:left w:val="single" w:sz="4" w:space="0" w:color="B7C2D6"/>
+              <w:bottom w:val="single" w:sz="4" w:space="0" w:color="B7C2D6"/>
+              <w:right w:val="single" w:sz="4" w:space="0" w:color="B7C2D6"/>
+            </w:tcBorders>
+            <w:tcMar>
+              <w:top w:w="80" w:type="dxa"/>
+              <w:left w:w="130" w:type="dxa"/>
+              <w:bottom w:w="80" w:type="dxa"/>
+              <w:right w:w="130" w:type="dxa"/>
+            </w:tcMar>
+            <w:vAlign w:val="center"/>
+          </w:tcPr>
+          <w:p>
+            <w:proofErr w:type="spellStart"/>
+            <w:r>
+              <w:t>Nombre</w:t>
+            </w:r>
+            <w:proofErr w:type="spellEnd"/>
+            <w:r>
+              <w:t xml:space="preserve"> </w:t>
+            </w:r>
+            <w:proofErr w:type="spellStart"/>
+            <w:r>
+              <w:t>registrado</w:t>
+            </w:r>
+            <w:proofErr w:type="spellEnd"/>
+            <w:r>
+              <w:t xml:space="preserve"> de la </w:t>
+            </w:r>
+            <w:proofErr w:type="spellStart"/>
+            <w:r>
+              <w:t>mascota</w:t>
+            </w:r>
+            <w:proofErr w:type="spellEnd"/>
+          </w:p>
+        </w:tc>
+        <w:tc>
+          <w:tcPr>
+            <w:tcW w:w="1800" w:type="dxa"/>
+            <w:tcBorders>
+              <w:top w:val="single" w:sz="4" w:space="0" w:color="B7C2D6"/>
+              <w:left w:val="single" w:sz="4" w:space="0" w:color="B7C2D6"/>
+              <w:bottom w:val="single" w:sz="4" w:space="0" w:color="B7C2D6"/>
+              <w:right w:val="single" w:sz="4" w:space="0" w:color="B7C2D6"/>
+            </w:tcBorders>
+            <w:tcMar>
+              <w:top w:w="80" w:type="dxa"/>
+              <w:left w:w="130" w:type="dxa"/>
+              <w:bottom w:w="80" w:type="dxa"/>
+              <w:right w:w="130" w:type="dxa"/>
+            </w:tcMar>
+            <w:vAlign w:val="center"/>
+          </w:tcPr>
+          <w:p>
+            <w:proofErr w:type="spellStart"/>
+            <w:r>
+              <w:t>Texto</w:t>
+            </w:r>
+            <w:proofErr w:type="spellEnd"/>
+          </w:p>
+        </w:tc>
+        <w:tc>
+          <w:tcPr>
+            <w:tcW w:w="2200" w:type="dxa"/>
+            <w:tcBorders>
+              <w:top w:val="single" w:sz="4" w:space="0" w:color="B7C2D6"/>
+              <w:left w:val="single" w:sz="4" w:space="0" w:color="B7C2D6"/>
+              <w:bottom w:val="single" w:sz="4" w:space="0" w:color="B7C2D6"/>
+              <w:right w:val="single" w:sz="4" w:space="0" w:color="B7C2D6"/>
+            </w:tcBorders>
+            <w:tcMar>
+              <w:top w:w="80" w:type="dxa"/>
+              <w:left w:w="130" w:type="dxa"/>
+              <w:bottom w:w="80" w:type="dxa"/>
+              <w:right w:w="130" w:type="dxa"/>
+            </w:tcMar>
+            <w:vAlign w:val="center"/>
+          </w:tcPr>
+          <w:p>
+            <w:proofErr w:type="spellStart"/>
+            <w:r>
+              <w:t>Longitud</w:t>
+            </w:r>
+            <w:proofErr w:type="spellEnd"/>
+            <w:r>
+              <w:t xml:space="preserve"> </w:t>
+            </w:r>
+            <w:proofErr w:type="spellStart"/>
+            <w:r>
+              <w:t>máxima</w:t>
+            </w:r>
+            <w:proofErr w:type="spellEnd"/>
+            <w:r>
+              <w:t xml:space="preserve">: 50 </w:t>
+            </w:r>
+            <w:proofErr w:type="spellStart"/>
+            <w:r>
+              <w:t>caracteres</w:t>
+            </w:r>
+            <w:proofErr w:type="spellEnd"/>
+            <w:r>
+              <w:t xml:space="preserve">. Se </w:t>
+            </w:r>
+            <w:proofErr w:type="spellStart"/>
+            <w:r>
+              <w:t>muestra</w:t>
+            </w:r>
+            <w:proofErr w:type="spellEnd"/>
+            <w:r>
+              <w:t xml:space="preserve"> junto al ID.</w:t>
+            </w:r>
+          </w:p>
+        </w:tc>
+        <w:tc>
+          <w:tcPr>
+            <w:tcW w:w="1000" w:type="dxa"/>
+            <w:tcBorders>
+              <w:top w:val="single" w:sz="4" w:space="0" w:color="B7C2D6"/>
+              <w:left w:val="single" w:sz="4" w:space="0" w:color="B7C2D6"/>
+              <w:bottom w:val="single" w:sz="4" w:space="0" w:color="B7C2D6"/>
+              <w:right w:val="single" w:sz="4" w:space="0" w:color="B7C2D6"/>
+            </w:tcBorders>
+            <w:tcMar>
+              <w:top w:w="80" w:type="dxa"/>
+              <w:left w:w="130" w:type="dxa"/>
+              <w:bottom w:w="80" w:type="dxa"/>
+              <w:right w:w="130" w:type="dxa"/>
+            </w:tcMar>
+            <w:vAlign w:val="center"/>
+          </w:tcPr>
+          <w:p>
+            <w:r>
+              <w:t>SI</w:t>
+            </w:r>
+          </w:p>
+        </w:tc>
+      </w:tr>
+      <w:tr>
+        <w:tc>
+          <w:tcPr>
+            <w:tcW w:w="2000" w:type="dxa"/>
+            <w:tcBorders>
+              <w:top w:val="single" w:sz="4" w:space="0" w:color="B7C2D6"/>
+              <w:left w:val="single" w:sz="4" w:space="0" w:color="B7C2D6"/>
+              <w:bottom w:val="single" w:sz="4" w:space="0" w:color="B7C2D6"/>
+              <w:right w:val="single" w:sz="4" w:space="0" w:color="B7C2D6"/>
+            </w:tcBorders>
+            <w:tcMar>
+              <w:top w:w="80" w:type="dxa"/>
+              <w:left w:w="130" w:type="dxa"/>
+              <w:bottom w:w="80" w:type="dxa"/>
+              <w:right w:w="130" w:type="dxa"/>
+            </w:tcMar>
+            <w:vAlign w:val="center"/>
+          </w:tcPr>
+          <w:p>
+            <w:proofErr w:type="spellStart"/>
+            <w:r>
+              <w:t>Especie</w:t>
+            </w:r>
+            <w:proofErr w:type="spellEnd"/>
+          </w:p>
+        </w:tc>
+        <w:tc>
+          <w:tcPr>
+            <w:tcW w:w="3080" w:type="dxa"/>
+            <w:tcBorders>
+              <w:top w:val="single" w:sz="4" w:space="0" w:color="B7C2D6"/>
+              <w:left w:val="single" w:sz="4" w:space="0" w:color="B7C2D6"/>
+              <w:bottom w:val="single" w:sz="4" w:space="0" w:color="B7C2D6"/>
+              <w:right w:val="single" w:sz="4" w:space="0" w:color="B7C2D6"/>
+            </w:tcBorders>
+            <w:tcMar>
+              <w:top w:w="80" w:type="dxa"/>
+              <w:left w:w="130" w:type="dxa"/>
+              <w:bottom w:w="80" w:type="dxa"/>
+              <w:right w:w="130" w:type="dxa"/>
+            </w:tcMar>
+            <w:vAlign w:val="center"/>
+          </w:tcPr>
+          <w:p>
+            <w:proofErr w:type="spellStart"/>
+            <w:r>
+              <w:t>Especie</w:t>
+            </w:r>
+            <w:proofErr w:type="spellEnd"/>
+            <w:r>
+              <w:t xml:space="preserve"> de la </w:t>
+            </w:r>
+            <w:proofErr w:type="spellStart"/>
+            <w:r>
+              <w:t>mascota</w:t>
+            </w:r>
+            <w:proofErr w:type="spellEnd"/>
+          </w:p>
+        </w:tc>
+        <w:tc>
+          <w:tcPr>
+            <w:tcW w:w="1800" w:type="dxa"/>
+            <w:tcBorders>
+              <w:top w:val="single" w:sz="4" w:space="0" w:color="B7C2D6"/>
+              <w:left w:val="single" w:sz="4" w:space="0" w:color="B7C2D6"/>
+              <w:bottom w:val="single" w:sz="4" w:space="0" w:color="B7C2D6"/>
+              <w:right w:val="single" w:sz="4" w:space="0" w:color="B7C2D6"/>
+            </w:tcBorders>
+            <w:tcMar>
+              <w:top w:w="80" w:type="dxa"/>
+              <w:left w:w="130" w:type="dxa"/>
+              <w:bottom w:w="80" w:type="dxa"/>
+              <w:right w:w="130" w:type="dxa"/>
+            </w:tcMar>
+            <w:vAlign w:val="center"/>
+          </w:tcPr>
+          <w:p>
+            <w:proofErr w:type="spellStart"/>
+            <w:r>
+              <w:t>Texto</w:t>
+            </w:r>
+            <w:proofErr w:type="spellEnd"/>
+          </w:p>
+        </w:tc>
+        <w:tc>
+          <w:tcPr>
+            <w:tcW w:w="2200" w:type="dxa"/>
+            <w:tcBorders>
+              <w:top w:val="single" w:sz="4" w:space="0" w:color="B7C2D6"/>
+              <w:left w:val="single" w:sz="4" w:space="0" w:color="B7C2D6"/>
+              <w:bottom w:val="single" w:sz="4" w:space="0" w:color="B7C2D6"/>
+              <w:right w:val="single" w:sz="4" w:space="0" w:color="B7C2D6"/>
+            </w:tcBorders>
+            <w:tcMar>
+              <w:top w:w="80" w:type="dxa"/>
+              <w:left w:w="130" w:type="dxa"/>
+              <w:bottom w:w="80" w:type="dxa"/>
+              <w:right w:w="130" w:type="dxa"/>
+            </w:tcMar>
+            <w:vAlign w:val="center"/>
+          </w:tcPr>
+          <w:p>
+            <w:proofErr w:type="spellStart"/>
+            <w:r>
+              <w:t>Valores</w:t>
+            </w:r>
+            <w:proofErr w:type="spellEnd"/>
+            <w:r>
+              <w:t xml:space="preserve">: PERRO, GATO, CONEJO, AVE, REPTIL. Se </w:t>
+            </w:r>
+            <w:proofErr w:type="spellStart"/>
+            <w:r>
+              <w:t>muestra</w:t>
+            </w:r>
+            <w:proofErr w:type="spellEnd"/>
+            <w:r>
+              <w:t xml:space="preserve"> para </w:t>
+            </w:r>
+            <w:proofErr w:type="spellStart"/>
+            <w:r>
+              <w:t>cada</w:t>
+            </w:r>
+            <w:proofErr w:type="spellEnd"/>
+            <w:r>
+              <w:t xml:space="preserve"> </w:t>
+            </w:r>
+            <w:proofErr w:type="spellStart"/>
+            <w:r>
+              <w:t>resultado</w:t>
+            </w:r>
+            <w:proofErr w:type="spellEnd"/>
+            <w:r>
+              <w:t>.</w:t>
+            </w:r>
           </w:p>
         </w:tc>
         <w:tc>
@@ -2347,7 +3320,27 @@
             </w:tcMar>
             <w:vAlign w:val="center"/>
           </w:tcPr>
-          <w:p/>
+          <w:p>
+            <w:r>
+              <w:t xml:space="preserve">E1: </w:t>
+            </w:r>
+            <w:proofErr w:type="spellStart"/>
+            <w:r>
+              <w:t>Usuario</w:t>
+            </w:r>
+            <w:proofErr w:type="spellEnd"/>
+            <w:r>
+              <w:t xml:space="preserve"> no </w:t>
+            </w:r>
+            <w:proofErr w:type="spellStart"/>
+            <w:r>
+              <w:t>autenticado</w:t>
+            </w:r>
+            <w:proofErr w:type="spellEnd"/>
+            <w:r>
+              <w:t>.</w:t>
+            </w:r>
+          </w:p>
         </w:tc>
       </w:tr>
       <w:tr>
@@ -2370,7 +3363,6 @@
           </w:tcPr>
           <w:p>
             <w:r>
-              <w:lastRenderedPageBreak/>
               <w:t>2</w:t>
             </w:r>
           </w:p>
@@ -2461,7 +3453,19 @@
             </w:tcMar>
             <w:vAlign w:val="center"/>
           </w:tcPr>
-          <w:p/>
+          <w:p>
+            <w:r>
+              <w:t xml:space="preserve">E2: Error de </w:t>
+            </w:r>
+            <w:proofErr w:type="spellStart"/>
+            <w:r>
+              <w:t>conexión</w:t>
+            </w:r>
+            <w:proofErr w:type="spellEnd"/>
+            <w:r>
+              <w:t xml:space="preserve"> con AWS Mongo Atlas.</w:t>
+            </w:r>
+          </w:p>
         </w:tc>
       </w:tr>
       <w:tr>
@@ -2574,7 +3578,35 @@
             </w:tcMar>
             <w:vAlign w:val="center"/>
           </w:tcPr>
-          <w:p/>
+          <w:p>
+            <w:r>
+              <w:t xml:space="preserve">E3: No </w:t>
+            </w:r>
+            <w:proofErr w:type="spellStart"/>
+            <w:r>
+              <w:t>selecciona</w:t>
+            </w:r>
+            <w:proofErr w:type="spellEnd"/>
+            <w:r>
+              <w:t xml:space="preserve"> </w:t>
+            </w:r>
+            <w:proofErr w:type="spellStart"/>
+            <w:r>
+              <w:t>ningún</w:t>
+            </w:r>
+            <w:proofErr w:type="spellEnd"/>
+            <w:r>
+              <w:t xml:space="preserve"> </w:t>
+            </w:r>
+            <w:proofErr w:type="spellStart"/>
+            <w:r>
+              <w:t>iterador</w:t>
+            </w:r>
+            <w:proofErr w:type="spellEnd"/>
+            <w:r>
+              <w:t>.</w:t>
+            </w:r>
+          </w:p>
         </w:tc>
       </w:tr>
       <w:tr>
@@ -2690,7 +3722,49 @@
             </w:tcMar>
             <w:vAlign w:val="center"/>
           </w:tcPr>
-          <w:p/>
+          <w:p>
+            <w:r>
+              <w:t>E</w:t>
+            </w:r>
+            <w:r>
+              <w:t>4</w:t>
+            </w:r>
+            <w:r>
+              <w:t xml:space="preserve">: </w:t>
+            </w:r>
+            <w:proofErr w:type="spellStart"/>
+            <w:r>
+              <w:t>Validación</w:t>
+            </w:r>
+            <w:proofErr w:type="spellEnd"/>
+            <w:r>
+              <w:t xml:space="preserve"> </w:t>
+            </w:r>
+            <w:proofErr w:type="spellStart"/>
+            <w:r>
+              <w:t>fallida</w:t>
+            </w:r>
+            <w:proofErr w:type="spellEnd"/>
+            <w:r>
+              <w:t xml:space="preserve"> — </w:t>
+            </w:r>
+            <w:proofErr w:type="spellStart"/>
+            <w:r>
+              <w:t>muestra</w:t>
+            </w:r>
+            <w:proofErr w:type="spellEnd"/>
+            <w:r>
+              <w:t xml:space="preserve"> </w:t>
+            </w:r>
+            <w:proofErr w:type="spellStart"/>
+            <w:r>
+              <w:t>mensaje</w:t>
+            </w:r>
+            <w:proofErr w:type="spellEnd"/>
+            <w:r>
+              <w:t xml:space="preserve"> de error.</w:t>
+            </w:r>
+          </w:p>
         </w:tc>
       </w:tr>
     </w:tbl>
@@ -3158,6 +4232,7 @@
           <w:sz w:val="24"/>
           <w:szCs w:val="24"/>
         </w:rPr>
+        <w:lastRenderedPageBreak/>
         <w:t>ANEXOS</w:t>
       </w:r>
     </w:p>
@@ -3314,7 +4389,11 @@
             </w:tcMar>
             <w:vAlign w:val="center"/>
           </w:tcPr>
-          <w:p/>
+          <w:p>
+            <w:r>
+              <w:t>RB-01</w:t>
+            </w:r>
+          </w:p>
         </w:tc>
         <w:tc>
           <w:tcPr>
@@ -3333,7 +4412,336 @@
             </w:tcMar>
             <w:vAlign w:val="center"/>
           </w:tcPr>
-          <w:p/>
+          <w:p>
+            <w:r>
+              <w:t xml:space="preserve">El </w:t>
+            </w:r>
+            <w:proofErr w:type="spellStart"/>
+            <w:r>
+              <w:t>sistema</w:t>
+            </w:r>
+            <w:proofErr w:type="spellEnd"/>
+            <w:r>
+              <w:t xml:space="preserve"> debe </w:t>
+            </w:r>
+            <w:proofErr w:type="spellStart"/>
+            <w:r>
+              <w:t>soportar</w:t>
+            </w:r>
+            <w:proofErr w:type="spellEnd"/>
+            <w:r>
+              <w:t xml:space="preserve"> hasta 10.000 </w:t>
+            </w:r>
+            <w:proofErr w:type="spellStart"/>
+            <w:r>
+              <w:t>mascotas</w:t>
+            </w:r>
+            <w:proofErr w:type="spellEnd"/>
+            <w:r>
+              <w:t xml:space="preserve"> </w:t>
+            </w:r>
+            <w:proofErr w:type="spellStart"/>
+            <w:r>
+              <w:t>registradas</w:t>
+            </w:r>
+            <w:proofErr w:type="spellEnd"/>
+            <w:r>
+              <w:t xml:space="preserve"> sin </w:t>
+            </w:r>
+            <w:proofErr w:type="spellStart"/>
+            <w:r>
+              <w:t>degradación</w:t>
+            </w:r>
+            <w:proofErr w:type="spellEnd"/>
+            <w:r>
+              <w:t xml:space="preserve"> </w:t>
+            </w:r>
+            <w:r>
+              <w:t xml:space="preserve">perceptible del </w:t>
+            </w:r>
+            <w:proofErr w:type="spellStart"/>
+            <w:r>
+              <w:t>rendimiento</w:t>
+            </w:r>
+            <w:proofErr w:type="spellEnd"/>
+            <w:r>
+              <w:t xml:space="preserve"> </w:t>
+            </w:r>
+            <w:proofErr w:type="spellStart"/>
+            <w:r>
+              <w:t>en</w:t>
+            </w:r>
+            <w:proofErr w:type="spellEnd"/>
+            <w:r>
+              <w:t xml:space="preserve"> las </w:t>
+            </w:r>
+            <w:proofErr w:type="spellStart"/>
+            <w:r>
+              <w:t>operaciones</w:t>
+            </w:r>
+            <w:proofErr w:type="spellEnd"/>
+            <w:r>
+              <w:t xml:space="preserve"> de </w:t>
+            </w:r>
+            <w:proofErr w:type="spellStart"/>
+            <w:r>
+              <w:t>filtrado</w:t>
+            </w:r>
+            <w:proofErr w:type="spellEnd"/>
+            <w:r>
+              <w:t>.</w:t>
+            </w:r>
+          </w:p>
+        </w:tc>
+      </w:tr>
+      <w:tr>
+        <w:tc>
+          <w:tcPr>
+            <w:tcW w:w="1400" w:type="dxa"/>
+            <w:tcBorders>
+              <w:top w:val="single" w:sz="4" w:space="0" w:color="B7C2D6"/>
+              <w:left w:val="single" w:sz="4" w:space="0" w:color="B7C2D6"/>
+              <w:bottom w:val="single" w:sz="4" w:space="0" w:color="B7C2D6"/>
+              <w:right w:val="single" w:sz="4" w:space="0" w:color="B7C2D6"/>
+            </w:tcBorders>
+            <w:tcMar>
+              <w:top w:w="80" w:type="dxa"/>
+              <w:left w:w="130" w:type="dxa"/>
+              <w:bottom w:w="80" w:type="dxa"/>
+              <w:right w:w="130" w:type="dxa"/>
+            </w:tcMar>
+            <w:vAlign w:val="center"/>
+          </w:tcPr>
+          <w:p>
+            <w:r>
+              <w:t>RB-02</w:t>
+            </w:r>
+          </w:p>
+        </w:tc>
+        <w:tc>
+          <w:tcPr>
+            <w:tcW w:w="8680" w:type="dxa"/>
+            <w:tcBorders>
+              <w:top w:val="single" w:sz="4" w:space="0" w:color="B7C2D6"/>
+              <w:left w:val="single" w:sz="4" w:space="0" w:color="B7C2D6"/>
+              <w:bottom w:val="single" w:sz="4" w:space="0" w:color="B7C2D6"/>
+              <w:right w:val="single" w:sz="4" w:space="0" w:color="B7C2D6"/>
+            </w:tcBorders>
+            <w:tcMar>
+              <w:top w:w="80" w:type="dxa"/>
+              <w:left w:w="130" w:type="dxa"/>
+              <w:bottom w:w="80" w:type="dxa"/>
+              <w:right w:w="130" w:type="dxa"/>
+            </w:tcMar>
+            <w:vAlign w:val="center"/>
+          </w:tcPr>
+          <w:p>
+            <w:proofErr w:type="spellStart"/>
+            <w:r>
+              <w:t>Cuando</w:t>
+            </w:r>
+            <w:proofErr w:type="spellEnd"/>
+            <w:r>
+              <w:t xml:space="preserve"> se </w:t>
+            </w:r>
+            <w:proofErr w:type="spellStart"/>
+            <w:r>
+              <w:t>aplican</w:t>
+            </w:r>
+            <w:proofErr w:type="spellEnd"/>
+            <w:r>
+              <w:t xml:space="preserve"> </w:t>
+            </w:r>
+            <w:proofErr w:type="spellStart"/>
+            <w:r>
+              <w:t>múltiples</w:t>
+            </w:r>
+            <w:proofErr w:type="spellEnd"/>
+            <w:r>
+              <w:t xml:space="preserve"> </w:t>
+            </w:r>
+            <w:proofErr w:type="spellStart"/>
+            <w:r>
+              <w:t>criterios</w:t>
+            </w:r>
+            <w:proofErr w:type="spellEnd"/>
+            <w:r>
+              <w:t xml:space="preserve"> de </w:t>
+            </w:r>
+            <w:proofErr w:type="spellStart"/>
+            <w:r>
+              <w:t>compatibilidad</w:t>
+            </w:r>
+            <w:proofErr w:type="spellEnd"/>
+            <w:r>
+              <w:t xml:space="preserve"> </w:t>
+            </w:r>
+            <w:proofErr w:type="spellStart"/>
+            <w:r>
+              <w:t>simultáneamente</w:t>
+            </w:r>
+            <w:proofErr w:type="spellEnd"/>
+            <w:r>
+              <w:t xml:space="preserve">, el </w:t>
+            </w:r>
+            <w:proofErr w:type="spellStart"/>
+            <w:r>
+              <w:t>sistema</w:t>
+            </w:r>
+            <w:proofErr w:type="spellEnd"/>
+            <w:r>
+              <w:t xml:space="preserve"> debe </w:t>
+            </w:r>
+            <w:proofErr w:type="spellStart"/>
+            <w:r>
+              <w:t>utilizar</w:t>
+            </w:r>
+            <w:proofErr w:type="spellEnd"/>
+            <w:r>
+              <w:t xml:space="preserve"> el </w:t>
+            </w:r>
+            <w:proofErr w:type="spellStart"/>
+            <w:r>
+              <w:t>operador</w:t>
+            </w:r>
+            <w:proofErr w:type="spellEnd"/>
+            <w:r>
+              <w:t xml:space="preserve"> </w:t>
+            </w:r>
+            <w:proofErr w:type="spellStart"/>
+            <w:r>
+              <w:t>lógico</w:t>
+            </w:r>
+            <w:proofErr w:type="spellEnd"/>
+            <w:r>
+              <w:t xml:space="preserve"> AND (</w:t>
+            </w:r>
+            <w:proofErr w:type="spellStart"/>
+            <w:r>
+              <w:t>intersección</w:t>
+            </w:r>
+            <w:proofErr w:type="spellEnd"/>
+            <w:r>
+              <w:t xml:space="preserve"> de conjuntos).</w:t>
+            </w:r>
+          </w:p>
+        </w:tc>
+      </w:tr>
+      <w:tr>
+        <w:tc>
+          <w:tcPr>
+            <w:tcW w:w="1400" w:type="dxa"/>
+            <w:tcBorders>
+              <w:top w:val="single" w:sz="4" w:space="0" w:color="B7C2D6"/>
+              <w:left w:val="single" w:sz="4" w:space="0" w:color="B7C2D6"/>
+              <w:bottom w:val="single" w:sz="4" w:space="0" w:color="B7C2D6"/>
+              <w:right w:val="single" w:sz="4" w:space="0" w:color="B7C2D6"/>
+            </w:tcBorders>
+            <w:tcMar>
+              <w:top w:w="80" w:type="dxa"/>
+              <w:left w:w="130" w:type="dxa"/>
+              <w:bottom w:w="80" w:type="dxa"/>
+              <w:right w:w="130" w:type="dxa"/>
+            </w:tcMar>
+            <w:vAlign w:val="center"/>
+          </w:tcPr>
+          <w:p>
+            <w:r>
+              <w:t>RB-03</w:t>
+            </w:r>
+          </w:p>
+        </w:tc>
+        <w:tc>
+          <w:tcPr>
+            <w:tcW w:w="8680" w:type="dxa"/>
+            <w:tcBorders>
+              <w:top w:val="single" w:sz="4" w:space="0" w:color="B7C2D6"/>
+              <w:left w:val="single" w:sz="4" w:space="0" w:color="B7C2D6"/>
+              <w:bottom w:val="single" w:sz="4" w:space="0" w:color="B7C2D6"/>
+              <w:right w:val="single" w:sz="4" w:space="0" w:color="B7C2D6"/>
+            </w:tcBorders>
+            <w:tcMar>
+              <w:top w:w="80" w:type="dxa"/>
+              <w:left w:w="130" w:type="dxa"/>
+              <w:bottom w:w="80" w:type="dxa"/>
+              <w:right w:w="130" w:type="dxa"/>
+            </w:tcMar>
+            <w:vAlign w:val="center"/>
+          </w:tcPr>
+          <w:p>
+            <w:r>
+              <w:t xml:space="preserve">Las </w:t>
+            </w:r>
+            <w:proofErr w:type="spellStart"/>
+            <w:r>
+              <w:t>especies</w:t>
+            </w:r>
+            <w:proofErr w:type="spellEnd"/>
+            <w:r>
+              <w:t xml:space="preserve"> </w:t>
+            </w:r>
+            <w:proofErr w:type="spellStart"/>
+            <w:r>
+              <w:t>permitidas</w:t>
+            </w:r>
+            <w:proofErr w:type="spellEnd"/>
+            <w:r>
+              <w:t xml:space="preserve"> </w:t>
+            </w:r>
+            <w:proofErr w:type="spellStart"/>
+            <w:r>
+              <w:t>en</w:t>
+            </w:r>
+            <w:proofErr w:type="spellEnd"/>
+            <w:r>
+              <w:t xml:space="preserve"> el </w:t>
+            </w:r>
+            <w:proofErr w:type="spellStart"/>
+            <w:r>
+              <w:t>sistema</w:t>
+            </w:r>
+            <w:proofErr w:type="spellEnd"/>
+            <w:r>
+              <w:t xml:space="preserve"> son: PERRO, GATO, CONEJO, AVE y REPTIL. No se </w:t>
+            </w:r>
+            <w:proofErr w:type="spellStart"/>
+            <w:r>
+              <w:t>admiten</w:t>
+            </w:r>
+            <w:proofErr w:type="spellEnd"/>
+            <w:r>
+              <w:t xml:space="preserve"> </w:t>
+            </w:r>
+            <w:proofErr w:type="spellStart"/>
+            <w:r>
+              <w:t>valores</w:t>
+            </w:r>
+            <w:proofErr w:type="spellEnd"/>
+            <w:r>
+              <w:t xml:space="preserve"> </w:t>
+            </w:r>
+            <w:proofErr w:type="spellStart"/>
+            <w:r>
+              <w:t>fuera</w:t>
+            </w:r>
+            <w:proofErr w:type="spellEnd"/>
+            <w:r>
+              <w:t xml:space="preserve"> de </w:t>
+            </w:r>
+            <w:proofErr w:type="spellStart"/>
+            <w:r>
+              <w:t>este</w:t>
+            </w:r>
+            <w:proofErr w:type="spellEnd"/>
+            <w:r>
+              <w:t xml:space="preserve"> </w:t>
+            </w:r>
+            <w:proofErr w:type="spellStart"/>
+            <w:r>
+              <w:t>dominio</w:t>
+            </w:r>
+            <w:proofErr w:type="spellEnd"/>
+          </w:p>
         </w:tc>
       </w:tr>
     </w:tbl>
@@ -3810,7 +5218,11 @@
             </w:tcMar>
             <w:vAlign w:val="center"/>
           </w:tcPr>
-          <w:p/>
+          <w:p>
+            <w:r>
+              <w:t>Santiago Garcia</w:t>
+            </w:r>
+          </w:p>
         </w:tc>
         <w:tc>
           <w:tcPr>
@@ -3839,7 +5251,39 @@
                 <w:sz w:val="20"/>
                 <w:szCs w:val="20"/>
               </w:rPr>
-              <w:t>DD/MM/AAAA</w:t>
+              <w:t>01</w:t>
+            </w:r>
+            <w:r>
+              <w:rPr>
+                <w:color w:val="1A1A1A"/>
+                <w:sz w:val="20"/>
+                <w:szCs w:val="20"/>
+              </w:rPr>
+              <w:t>/</w:t>
+            </w:r>
+            <w:r>
+              <w:rPr>
+                <w:color w:val="1A1A1A"/>
+                <w:sz w:val="20"/>
+                <w:szCs w:val="20"/>
+              </w:rPr>
+              <w:t>09</w:t>
+            </w:r>
+            <w:r>
+              <w:rPr>
+                <w:color w:val="1A1A1A"/>
+                <w:sz w:val="20"/>
+                <w:szCs w:val="20"/>
+              </w:rPr>
+              <w:t>/</w:t>
+            </w:r>
+            <w:r>
+              <w:rPr>
+                <w:color w:val="1A1A1A"/>
+                <w:sz w:val="20"/>
+                <w:szCs w:val="20"/>
+              </w:rPr>
+              <w:t>2026</w:t>
             </w:r>
           </w:p>
         </w:tc>
@@ -3931,6 +5375,8 @@
         </w:pBdr>
         <w:spacing w:line="276" w:lineRule="auto"/>
       </w:pPr>
+      <w:bookmarkStart w:id="0" w:name="_GoBack"/>
+      <w:bookmarkEnd w:id="0"/>
     </w:p>
     <w:sectPr>
       <w:footerReference w:type="default" r:id="rId11"/>
@@ -5229,6 +6675,21 @@
 </file>
 
 <file path=customXml/item1.xml><?xml version="1.0" encoding="utf-8"?>
+<p:properties xmlns:p="http://schemas.microsoft.com/office/2006/metadata/properties" xmlns:xsi="http://www.w3.org/2001/XMLSchema-instance" xmlns:pc="http://schemas.microsoft.com/office/infopath/2007/PartnerControls">
+  <documentManagement/>
+</p:properties>
+</file>
+
+<file path=customXml/item2.xml><?xml version="1.0" encoding="utf-8"?>
+<?mso-contentType ?>
+<FormTemplates xmlns="http://schemas.microsoft.com/sharepoint/v3/contenttype/forms">
+  <Display>DocumentLibraryForm</Display>
+  <Edit>DocumentLibraryForm</Edit>
+  <New>DocumentLibraryForm</New>
+</FormTemplates>
+</file>
+
+<file path=customXml/item3.xml><?xml version="1.0" encoding="utf-8"?>
 <ct:contentTypeSchema xmlns:ct="http://schemas.microsoft.com/office/2006/metadata/contentType" xmlns:ma="http://schemas.microsoft.com/office/2006/metadata/properties/metaAttributes" ct:_="" ma:_="" ma:contentTypeName="Document" ma:contentTypeID="0x0101002B5BAC97FAEABB4E9C157EE386378C88" ma:contentTypeVersion="3" ma:contentTypeDescription="Create a new document." ma:contentTypeScope="" ma:versionID="85d5ae5d0ece85e3f4382fb4c1c77f0c">
   <xsd:schema xmlns:xsd="http://www.w3.org/2001/XMLSchema" xmlns:xs="http://www.w3.org/2001/XMLSchema" xmlns:p="http://schemas.microsoft.com/office/2006/metadata/properties" xmlns:ns2="a4ca1935-4d02-4ee2-b565-35cc2fa3819b" targetNamespace="http://schemas.microsoft.com/office/2006/metadata/properties" ma:root="true" ma:fieldsID="32962a3a470fc06c75339fbd17211022" ns2:_="">
     <xsd:import namespace="a4ca1935-4d02-4ee2-b565-35cc2fa3819b"/>
@@ -5366,21 +6827,6 @@
 </ct:contentTypeSchema>
 </file>
 
-<file path=customXml/item2.xml><?xml version="1.0" encoding="utf-8"?>
-<?mso-contentType ?>
-<FormTemplates xmlns="http://schemas.microsoft.com/sharepoint/v3/contenttype/forms">
-  <Display>DocumentLibraryForm</Display>
-  <Edit>DocumentLibraryForm</Edit>
-  <New>DocumentLibraryForm</New>
-</FormTemplates>
-</file>
-
-<file path=customXml/item3.xml><?xml version="1.0" encoding="utf-8"?>
-<p:properties xmlns:p="http://schemas.microsoft.com/office/2006/metadata/properties" xmlns:xsi="http://www.w3.org/2001/XMLSchema-instance" xmlns:pc="http://schemas.microsoft.com/office/infopath/2007/PartnerControls">
-  <documentManagement/>
-</p:properties>
-</file>
-
 <file path=customXml/item4.xml><?xml version="1.0" encoding="utf-8"?>
 <go:gDocsCustomXmlDataStorage xmlns:go="http://customooxmlschemas.google.com/" xmlns:r="http://schemas.openxmlformats.org/officeDocument/2006/relationships" uri="GoogleDocsCustomDataVersion2">
   <go:docsCustomData xmlns:go="http://customooxmlschemas.google.com/" roundtripDataSignature="AMtx7mjtEGxBuoPmVpJaMSOuw1TLIxq6mQ==">CgMxLjA4AHIhMUZvRXV1d25Yd002YkVaclVlRHFtdHdrLTEwdFVVMFkw</go:docsCustomData>
@@ -5388,6 +6834,23 @@
 </file>
 
 <file path=customXml/itemProps1.xml><?xml version="1.0" encoding="utf-8"?>
+<ds:datastoreItem xmlns:ds="http://schemas.openxmlformats.org/officeDocument/2006/customXml" ds:itemID="{2C8DB052-A8C5-4A76-8631-0D388F12579B}">
+  <ds:schemaRefs>
+    <ds:schemaRef ds:uri="http://schemas.microsoft.com/office/2006/metadata/properties"/>
+    <ds:schemaRef ds:uri="http://schemas.microsoft.com/office/infopath/2007/PartnerControls"/>
+  </ds:schemaRefs>
+</ds:datastoreItem>
+</file>
+
+<file path=customXml/itemProps2.xml><?xml version="1.0" encoding="utf-8"?>
+<ds:datastoreItem xmlns:ds="http://schemas.openxmlformats.org/officeDocument/2006/customXml" ds:itemID="{F5FEE064-F001-4A19-93A2-D82A57462B81}">
+  <ds:schemaRefs>
+    <ds:schemaRef ds:uri="http://schemas.microsoft.com/sharepoint/v3/contenttype/forms"/>
+  </ds:schemaRefs>
+</ds:datastoreItem>
+</file>
+
+<file path=customXml/itemProps3.xml><?xml version="1.0" encoding="utf-8"?>
 <ds:datastoreItem xmlns:ds="http://schemas.openxmlformats.org/officeDocument/2006/customXml" ds:itemID="{5CF694BF-BF02-49BD-87C1-9974C33CEA64}">
   <ds:schemaRefs>
     <ds:schemaRef ds:uri="http://schemas.microsoft.com/office/2006/metadata/contentType"/>
@@ -5405,23 +6868,6 @@
 </ds:datastoreItem>
 </file>
 
-<file path=customXml/itemProps2.xml><?xml version="1.0" encoding="utf-8"?>
-<ds:datastoreItem xmlns:ds="http://schemas.openxmlformats.org/officeDocument/2006/customXml" ds:itemID="{F5FEE064-F001-4A19-93A2-D82A57462B81}">
-  <ds:schemaRefs>
-    <ds:schemaRef ds:uri="http://schemas.microsoft.com/sharepoint/v3/contenttype/forms"/>
-  </ds:schemaRefs>
-</ds:datastoreItem>
-</file>
-
-<file path=customXml/itemProps3.xml><?xml version="1.0" encoding="utf-8"?>
-<ds:datastoreItem xmlns:ds="http://schemas.openxmlformats.org/officeDocument/2006/customXml" ds:itemID="{2C8DB052-A8C5-4A76-8631-0D388F12579B}">
-  <ds:schemaRefs>
-    <ds:schemaRef ds:uri="http://schemas.microsoft.com/office/2006/metadata/properties"/>
-    <ds:schemaRef ds:uri="http://schemas.microsoft.com/office/infopath/2007/PartnerControls"/>
-  </ds:schemaRefs>
-</ds:datastoreItem>
-</file>
-
 <file path=customXml/itemProps4.xml><?xml version="1.0" encoding="utf-8"?>
 <ds:datastoreItem xmlns:ds="http://schemas.openxmlformats.org/officeDocument/2006/customXml" ds:itemID="{11111111-1234-1234-1234-123412341234}">
   <ds:schemaRefs>

</xml_diff>